<commit_message>
chore: Create HW4 submission archive and update report document.
</commit_message>
<xml_diff>
--- a/hw4/NLP_HW4_NTU_r14942146.docx
+++ b/hw4/NLP_HW4_NTU_r14942146.docx
@@ -517,12 +517,12 @@
           <wp:inline distB="114300" distT="114300" distL="114300" distR="114300">
             <wp:extent cx="5731200" cy="1257300"/>
             <wp:effectExtent b="0" l="0" r="0" t="0"/>
-            <wp:docPr id="3" name="image2.png"/>
+            <wp:docPr id="3" name="image1.png"/>
             <a:graphic>
               <a:graphicData uri="http://schemas.openxmlformats.org/drawingml/2006/picture">
                 <pic:pic>
                   <pic:nvPicPr>
-                    <pic:cNvPr id="0" name="image2.png"/>
+                    <pic:cNvPr id="0" name="image1.png"/>
                     <pic:cNvPicPr preferRelativeResize="0"/>
                   </pic:nvPicPr>
                   <pic:blipFill>
@@ -715,12 +715,12 @@
           <wp:inline distB="114300" distT="114300" distL="114300" distR="114300">
             <wp:extent cx="5731200" cy="3924300"/>
             <wp:effectExtent b="0" l="0" r="0" t="0"/>
-            <wp:docPr id="1" name="image5.png"/>
+            <wp:docPr id="2" name="image4.png"/>
             <a:graphic>
               <a:graphicData uri="http://schemas.openxmlformats.org/drawingml/2006/picture">
                 <pic:pic>
                   <pic:nvPicPr>
-                    <pic:cNvPr id="0" name="image5.png"/>
+                    <pic:cNvPr id="0" name="image4.png"/>
                     <pic:cNvPicPr preferRelativeResize="0"/>
                   </pic:nvPicPr>
                   <pic:blipFill>
@@ -1585,7 +1585,7 @@
               <w:rPr>
                 <w:rtl w:val="0"/>
               </w:rPr>
-              <w:t xml:space="preserve">55.33%</w:t>
+              <w:t xml:space="preserve">54.00%</w:t>
             </w:r>
           </w:p>
         </w:tc>
@@ -1745,12 +1745,12 @@
           <wp:inline distB="114300" distT="114300" distL="114300" distR="114300">
             <wp:extent cx="5731200" cy="774700"/>
             <wp:effectExtent b="0" l="0" r="0" t="0"/>
-            <wp:docPr id="5" name="image3.png"/>
+            <wp:docPr id="5" name="image5.png"/>
             <a:graphic>
               <a:graphicData uri="http://schemas.openxmlformats.org/drawingml/2006/picture">
                 <pic:pic>
                   <pic:nvPicPr>
-                    <pic:cNvPr id="0" name="image3.png"/>
+                    <pic:cNvPr id="0" name="image5.png"/>
                     <pic:cNvPicPr preferRelativeResize="0"/>
                   </pic:nvPicPr>
                   <pic:blipFill>
@@ -1811,12 +1811,12 @@
           <wp:inline distB="114300" distT="114300" distL="114300" distR="114300">
             <wp:extent cx="5731200" cy="1473200"/>
             <wp:effectExtent b="0" l="0" r="0" t="0"/>
-            <wp:docPr id="4" name="image4.png"/>
+            <wp:docPr id="4" name="image2.png"/>
             <a:graphic>
               <a:graphicData uri="http://schemas.openxmlformats.org/drawingml/2006/picture">
                 <pic:pic>
                   <pic:nvPicPr>
-                    <pic:cNvPr id="0" name="image4.png"/>
+                    <pic:cNvPr id="0" name="image2.png"/>
                     <pic:cNvPicPr preferRelativeResize="0"/>
                   </pic:nvPicPr>
                   <pic:blipFill>
@@ -4356,14 +4356,14 @@
         </w:rPr>
         <w:drawing>
           <wp:inline distB="114300" distT="114300" distL="114300" distR="114300">
-            <wp:extent cx="5731200" cy="1625600"/>
+            <wp:extent cx="4095750" cy="1266825"/>
             <wp:effectExtent b="0" l="0" r="0" t="0"/>
-            <wp:docPr id="2" name="image1.png"/>
+            <wp:docPr id="1" name="image3.png"/>
             <a:graphic>
               <a:graphicData uri="http://schemas.openxmlformats.org/drawingml/2006/picture">
                 <pic:pic>
                   <pic:nvPicPr>
-                    <pic:cNvPr id="0" name="image1.png"/>
+                    <pic:cNvPr id="0" name="image3.png"/>
                     <pic:cNvPicPr preferRelativeResize="0"/>
                   </pic:nvPicPr>
                   <pic:blipFill>
@@ -4376,7 +4376,7 @@
                   <pic:spPr>
                     <a:xfrm>
                       <a:off x="0" y="0"/>
-                      <a:ext cx="5731200" cy="1625600"/>
+                      <a:ext cx="4095750" cy="1266825"/>
                     </a:xfrm>
                     <a:prstGeom prst="rect"/>
                     <a:ln/>
@@ -4417,7 +4417,7 @@
         <w:rPr>
           <w:rtl w:val="0"/>
         </w:rPr>
-        <w:t xml:space="preserve">We categorized errors from our best model (55.33% EM):</w:t>
+        <w:t xml:space="preserve">We categorized errors from our best model (54.00% EM):</w:t>
       </w:r>
     </w:p>
     <w:p>
@@ -5225,7 +5225,7 @@
               <w:rPr>
                 <w:rtl w:val="0"/>
               </w:rPr>
-              <w:t xml:space="preserve">55% (our result)</w:t>
+              <w:t xml:space="preserve">54% (our result)</w:t>
             </w:r>
           </w:p>
         </w:tc>

</xml_diff>